<commit_message>
updated communities, analyses, charts
</commit_message>
<xml_diff>
--- a/outputs/analysis/lobbying_networks_analysis_report.docx
+++ b/outputs/analysis/lobbying_networks_analysis_report.docx
@@ -686,7 +686,7 @@
           <w:sz w:val="20"/>
           <w:szCs w:val="20"/>
         </w:rPr>
-        <w:t xml:space="preserve">Ranks all 293 Fortune 500 firms in the directed influence network by net_strength = Σ_j[RBO(i,j) × net_temporal(i,j)]. Computes sector leaderboards for five Leiden communities (Finance, Tech/Telecom, Defense/Industrial, Energy/Utilities, Health/Pharma). Tests Spearman correlation of net_strength against total lobbying spend and bill portfolio breadth. Produces: ranked table, sector-colored bar chart, and spend vs. agenda-setting scatter.</w:t>
+        <w:t xml:space="preserve">Ranks all 293 Fortune 500 firms in the directed influence network by net_strength = Σ_j[RBO(i,j) × net_temporal(i,j)]. Computes sector leaderboards for six Leiden communities (Finance/Insurance, Tech/Telecom, Energy/Utilities, Defense/Industrial, Health/Pharma, Consumer/Manufacturing). Tests Spearman correlation of net_strength against total lobbying spend and bill portfolio breadth. Produces: ranked table, sector-colored bar chart, and spend vs. agenda-setting scatter.</w:t>
       </w:r>
     </w:p>
     <w:p>
@@ -2535,7 +2535,7 @@
           <w:sz w:val="20"/>
           <w:szCs w:val="20"/>
         </w:rPr>
-        <w:t xml:space="preserve">Computes Kendall's coefficient of concordance (W) for the within-community net_strength rank of firms across seven congresses (111th–117th). Separately examines each of the five Leiden communities. Produces adjacent-congress Spearman ρ for each sector. Also identifies firms that appear in the within-community top-5 in ≥5 of 7 congresses ('persistent leaders'). Produces: Kendall's W bar chart and Energy/Utilities rank-flow (bump) chart for top-5 firms.</w:t>
+        <w:t xml:space="preserve">Computes Kendall's coefficient of concordance (W) for the within-community net_strength rank of firms across seven congresses (111th–117th). Separately examines each of the six Leiden communities (Consumer/Manufacturing excluded from W test due to insufficient stable firms). Produces adjacent-congress Spearman ρ for each sector. Also identifies firms that appear in the within-community top-5 in ≥5 of 7 congresses ('persistent leaders'). Produces: Kendall's W bar chart and Energy/Utilities rank-flow (bump) chart for top-5 firms.</w:t>
       </w:r>
     </w:p>
     <w:p>

</xml_diff>